<commit_message>
updated output for RDA
</commit_message>
<xml_diff>
--- a/inst/submission/01_cover.docx
+++ b/inst/submission/01_cover.docx
@@ -81,13 +81,33 @@
                 <w:sz w:val="20"/>
                 <w:szCs w:val="20"/>
               </w:rPr>
-              <w:t>We are pleased to submit our manuscript, "Causal Discovery from Complex Survey Data: A Survey-Weighted Ordinal Bayesian Network for Social Determinants of Health” along with its supplementary material, for consideration for publication in the </w:t>
-            </w:r>
-            <w:r>
-              <w:rPr>
-                <w:rFonts w:ascii="Arial" w:hAnsi="Arial" w:cs="Arial"/>
-                <w:i/>
-                <w:iCs/>
+              <w:t>We are pleased to submit our manuscript, "</w:t>
+            </w:r>
+            <w:r>
+              <w:rPr>
+                <w:rFonts w:ascii="Arial" w:hAnsi="Arial" w:cs="Arial"/>
+                <w:b/>
+                <w:bCs/>
+                <w:color w:val="000000"/>
+                <w:sz w:val="20"/>
+                <w:szCs w:val="20"/>
+              </w:rPr>
+              <w:t>Survey-Weighted Ordinal Causal Discovery: Application to Veteran Social Needs, Mental Health, and Well-Being</w:t>
+            </w:r>
+            <w:r>
+              <w:rPr>
+                <w:rFonts w:ascii="Arial" w:hAnsi="Arial" w:cs="Arial"/>
+                <w:color w:val="000000"/>
+                <w:sz w:val="20"/>
+                <w:szCs w:val="20"/>
+              </w:rPr>
+              <w:t xml:space="preserve">," for consideration in the </w:t>
+            </w:r>
+            <w:r>
+              <w:rPr>
+                <w:rFonts w:ascii="Arial" w:hAnsi="Arial" w:cs="Arial"/>
+                <w:b/>
+                <w:bCs/>
                 <w:color w:val="000000"/>
                 <w:sz w:val="20"/>
                 <w:szCs w:val="20"/>
@@ -136,69 +156,45 @@
                 <w:sz w:val="20"/>
                 <w:szCs w:val="20"/>
               </w:rPr>
-              <w:t>This paper bridges a critical gap at the intersection of causal inference, survey methodology, and public health policy. While causal discovery algorithms offer a data-driven approach to learning causal structures, </w:t>
-            </w:r>
-            <w:r>
-              <w:rPr>
-                <w:rFonts w:ascii="Arial" w:hAnsi="Arial" w:cs="Arial"/>
-                <w:b/>
-                <w:bCs/>
-                <w:color w:val="000000"/>
-                <w:sz w:val="20"/>
-                <w:szCs w:val="20"/>
-              </w:rPr>
-              <w:t>existing methods fail when applied to survey data</w:t>
-            </w:r>
-            <w:r>
-              <w:rPr>
-                <w:rFonts w:ascii="Arial" w:hAnsi="Arial" w:cs="Arial"/>
-                <w:color w:val="000000"/>
-                <w:sz w:val="20"/>
-                <w:szCs w:val="20"/>
-              </w:rPr>
-              <w:t> because they rely on the assumption of independent and identically distributed data. When modern surveys employ unequal selection probabilities, </w:t>
-            </w:r>
-            <w:r>
-              <w:rPr>
-                <w:rFonts w:ascii="Arial" w:hAnsi="Arial" w:cs="Arial"/>
-                <w:b/>
-                <w:bCs/>
-                <w:color w:val="000000"/>
-                <w:sz w:val="20"/>
-                <w:szCs w:val="20"/>
-              </w:rPr>
-              <w:t xml:space="preserve">ignoring the sampling design distorts </w:t>
-            </w:r>
-            <w:r>
-              <w:rPr>
-                <w:rFonts w:ascii="Arial" w:hAnsi="Arial" w:cs="Arial"/>
-                <w:b/>
-                <w:bCs/>
-                <w:color w:val="000000"/>
-                <w:sz w:val="20"/>
-                <w:szCs w:val="20"/>
-              </w:rPr>
-              <w:t>inferred causal</w:t>
-            </w:r>
-            <w:r>
-              <w:rPr>
-                <w:rFonts w:ascii="Arial" w:hAnsi="Arial" w:cs="Arial"/>
-                <w:b/>
-                <w:bCs/>
-                <w:color w:val="000000"/>
-                <w:sz w:val="20"/>
-                <w:szCs w:val="20"/>
-              </w:rPr>
-              <w:t xml:space="preserve"> relationships</w:t>
-            </w:r>
-            <w:r>
-              <w:rPr>
-                <w:rFonts w:ascii="Arial" w:hAnsi="Arial" w:cs="Arial"/>
-                <w:color w:val="000000"/>
-                <w:sz w:val="20"/>
-                <w:szCs w:val="20"/>
-              </w:rPr>
-              <w:t>, causing unweighted algorithms to infer spurious causal edges.</w:t>
+              <w:t xml:space="preserve">The paper </w:t>
+            </w:r>
+            <w:r>
+              <w:rPr>
+                <w:rFonts w:ascii="Arial" w:hAnsi="Arial" w:cs="Arial"/>
+                <w:color w:val="000000"/>
+                <w:sz w:val="20"/>
+                <w:szCs w:val="20"/>
+                <w:u w:val="single"/>
+              </w:rPr>
+              <w:t>addresses a methodological gap at the intersection of causal discovery and survey statistics</w:t>
+            </w:r>
+            <w:r>
+              <w:rPr>
+                <w:rFonts w:ascii="Arial" w:hAnsi="Arial" w:cs="Arial"/>
+                <w:color w:val="000000"/>
+                <w:sz w:val="20"/>
+                <w:szCs w:val="20"/>
+              </w:rPr>
+              <w:t xml:space="preserve">. Existing causal discovery algorithms assume i.i.d. data, but modern surveys use unequal selection probabilities; applying these algorithms naively to survey data yields graphs that reflect the sampling design rather than the population-level causal structure. </w:t>
+            </w:r>
+            <w:r>
+              <w:rPr>
+                <w:rFonts w:ascii="Arial" w:hAnsi="Arial" w:cs="Arial"/>
+                <w:color w:val="000000"/>
+                <w:sz w:val="20"/>
+                <w:szCs w:val="20"/>
+                <w:u w:val="single"/>
+              </w:rPr>
+              <w:t>To our knowledge, this problem has not been formally addressed in the causal discovery literature</w:t>
+            </w:r>
+            <w:r>
+              <w:rPr>
+                <w:rFonts w:ascii="Arial" w:hAnsi="Arial" w:cs="Arial"/>
+                <w:color w:val="000000"/>
+                <w:sz w:val="20"/>
+                <w:szCs w:val="20"/>
+              </w:rPr>
+              <w:t>.</w:t>
             </w:r>
           </w:p>
           <w:p>
@@ -233,7 +229,7 @@
                 <w:sz w:val="20"/>
                 <w:szCs w:val="20"/>
               </w:rPr>
-              <w:t>To overcome this, we introduce the </w:t>
+              <w:t xml:space="preserve">We introduce the </w:t>
             </w:r>
             <w:r>
               <w:rPr>
@@ -244,7 +240,7 @@
                 <w:sz w:val="20"/>
                 <w:szCs w:val="20"/>
               </w:rPr>
-              <w:t>survey-weighted ordinal Bayesian network (</w:t>
+              <w:t>survey-weighted, covariate-adjusted ordinal Bayesian network (</w:t>
             </w:r>
             <w:proofErr w:type="spellStart"/>
             <w:r>
@@ -268,56 +264,16 @@
                 <w:sz w:val="20"/>
                 <w:szCs w:val="20"/>
               </w:rPr>
-              <w:t>)</w:t>
-            </w:r>
-            <w:r>
-              <w:rPr>
-                <w:rFonts w:ascii="Arial" w:hAnsi="Arial" w:cs="Arial"/>
-                <w:color w:val="000000"/>
-                <w:sz w:val="20"/>
-                <w:szCs w:val="20"/>
-              </w:rPr>
-              <w:t xml:space="preserve">. By integrating normalized Horvitz-Thompson weights and Kish's effective sample size into a pseudo-BIC scoring </w:t>
-            </w:r>
-            <w:proofErr w:type="gramStart"/>
-            <w:r>
-              <w:rPr>
-                <w:rFonts w:ascii="Arial" w:hAnsi="Arial" w:cs="Arial"/>
-                <w:color w:val="000000"/>
-                <w:sz w:val="20"/>
-                <w:szCs w:val="20"/>
-              </w:rPr>
-              <w:t>framework, and</w:t>
-            </w:r>
-            <w:proofErr w:type="gramEnd"/>
-            <w:r>
-              <w:rPr>
-                <w:rFonts w:ascii="Arial" w:hAnsi="Arial" w:cs="Arial"/>
-                <w:color w:val="000000"/>
-                <w:sz w:val="20"/>
-                <w:szCs w:val="20"/>
-              </w:rPr>
-              <w:t xml:space="preserve"> developing a two-step scoring procedure that separates skeleton discovery from edge orientation, our method </w:t>
-            </w:r>
-            <w:r>
-              <w:rPr>
-                <w:rFonts w:ascii="Arial" w:hAnsi="Arial" w:cs="Arial"/>
-                <w:b/>
-                <w:bCs/>
-                <w:color w:val="000000"/>
-                <w:sz w:val="20"/>
-                <w:szCs w:val="20"/>
-              </w:rPr>
-              <w:t>consistently recovers the true population-level causal graph under complex survey designs</w:t>
-            </w:r>
-            <w:r>
-              <w:rPr>
-                <w:rFonts w:ascii="Arial" w:hAnsi="Arial" w:cs="Arial"/>
-                <w:color w:val="000000"/>
-                <w:sz w:val="20"/>
-                <w:szCs w:val="20"/>
-              </w:rPr>
-              <w:t>.</w:t>
+              <w:t>).</w:t>
+            </w:r>
+            <w:r>
+              <w:rPr>
+                <w:rFonts w:ascii="Arial" w:hAnsi="Arial" w:cs="Arial"/>
+                <w:color w:val="000000"/>
+                <w:sz w:val="20"/>
+                <w:szCs w:val="20"/>
+              </w:rPr>
+              <w:t xml:space="preserve"> The method integrates Horvitz-Thompson weights and Kish's effective sample size into a pseudo-BIC scoring framework, accommodates exogenous covariate adjustment without expanding the search space, presents two scoring variants (single-BIC and split-BIC) with a regime-based selection rule for heterogeneous ordinal scales, and supports structural constraints from domain knowledge. We prove that the framework consistently recovers the true population-level causal graph under a joint superpopulation-and-design asymptotic framework.</w:t>
             </w:r>
           </w:p>
           <w:p>
@@ -352,7 +308,7 @@
                 <w:sz w:val="20"/>
                 <w:szCs w:val="20"/>
               </w:rPr>
-              <w:t xml:space="preserve">We demonstrate the practical necessity of this methodology by applying </w:t>
+              <w:t xml:space="preserve">We apply </w:t>
             </w:r>
             <w:proofErr w:type="spellStart"/>
             <w:r>
@@ -372,27 +328,7 @@
                 <w:sz w:val="20"/>
                 <w:szCs w:val="20"/>
               </w:rPr>
-              <w:t xml:space="preserve"> to national Veterans Affairs (VA) CAHPS survey data to map the causal architecture of Veteran social determinants of health (SDOH). Using standard unweighted methods results in a distorted causal graph that </w:t>
-            </w:r>
-            <w:r>
-              <w:rPr>
-                <w:rFonts w:ascii="Arial" w:hAnsi="Arial" w:cs="Arial"/>
-                <w:b/>
-                <w:bCs/>
-                <w:color w:val="000000"/>
-                <w:sz w:val="20"/>
-                <w:szCs w:val="20"/>
-              </w:rPr>
-              <w:t>hallucinates discrimination as the root cause</w:t>
-            </w:r>
-            <w:r>
-              <w:rPr>
-                <w:rFonts w:ascii="Arial" w:hAnsi="Arial" w:cs="Arial"/>
-                <w:color w:val="000000"/>
-                <w:sz w:val="20"/>
-                <w:szCs w:val="20"/>
-              </w:rPr>
-              <w:t xml:space="preserve"> of material deprivation. By explicitly modeling the sampling design, </w:t>
+              <w:t xml:space="preserve"> to national VA CAHPS survey data to map the causal architecture of social determinants of health among U.S. Veterans. The weighted analysis identifies unmet basic needs as the upstream causal hub, with discrimination and isolation serving as proximal mediators to mental health and well-being. An unweighted analysis of the same data places discrimination upstream of material deprivation — a qualitatively different and, under the stated assumptions, incorrect causal ordering. Complementary simulations confirm that the survey-weighting problem extends to other algorithm families (PC, FCI, </w:t>
             </w:r>
             <w:proofErr w:type="spellStart"/>
             <w:r>
@@ -402,7 +338,7 @@
                 <w:sz w:val="20"/>
                 <w:szCs w:val="20"/>
               </w:rPr>
-              <w:t>swa-oBn</w:t>
+              <w:t>LiNGAM</w:t>
             </w:r>
             <w:proofErr w:type="spellEnd"/>
             <w:r>
@@ -412,27 +348,7 @@
                 <w:sz w:val="20"/>
                 <w:szCs w:val="20"/>
               </w:rPr>
-              <w:t xml:space="preserve"> recovers the true structural hierarchy: </w:t>
-            </w:r>
-            <w:r>
-              <w:rPr>
-                <w:rFonts w:ascii="Arial" w:hAnsi="Arial" w:cs="Arial"/>
-                <w:b/>
-                <w:bCs/>
-                <w:color w:val="000000"/>
-                <w:sz w:val="20"/>
-                <w:szCs w:val="20"/>
-              </w:rPr>
-              <w:t>unmet basic needs (food, housing) are the actual upstream causal hub</w:t>
-            </w:r>
-            <w:r>
-              <w:rPr>
-                <w:rFonts w:ascii="Arial" w:hAnsi="Arial" w:cs="Arial"/>
-                <w:color w:val="000000"/>
-                <w:sz w:val="20"/>
-                <w:szCs w:val="20"/>
-              </w:rPr>
-              <w:t>, while discrimination and social isolation serve strictly as proximal mediating pathways to poor mental health.</w:t>
+              <w:t>).</w:t>
             </w:r>
           </w:p>
           <w:p>
@@ -467,67 +383,46 @@
                 <w:sz w:val="20"/>
                 <w:szCs w:val="20"/>
               </w:rPr>
-              <w:t>These findings provide the directional knowledge required for VA policymakers to </w:t>
-            </w:r>
-            <w:r>
-              <w:rPr>
-                <w:rFonts w:ascii="Arial" w:hAnsi="Arial" w:cs="Arial"/>
-                <w:b/>
-                <w:bCs/>
-                <w:color w:val="000000"/>
-                <w:sz w:val="20"/>
-                <w:szCs w:val="20"/>
-              </w:rPr>
-              <w:t>optimize the allocation of intervention resources</w:t>
-            </w:r>
-            <w:r>
-              <w:rPr>
-                <w:rFonts w:ascii="Arial" w:hAnsi="Arial" w:cs="Arial"/>
-                <w:color w:val="000000"/>
-                <w:sz w:val="20"/>
-                <w:szCs w:val="20"/>
-              </w:rPr>
-              <w:t xml:space="preserve">, directly answering the call for rigorous, actionable insights into health equity. The enclosed supplementary material provides full proofs of our theoretical results, details on our </w:t>
-            </w:r>
-            <w:proofErr w:type="spellStart"/>
-            <w:r>
-              <w:rPr>
-                <w:rFonts w:ascii="Arial" w:hAnsi="Arial" w:cs="Arial"/>
-                <w:color w:val="000000"/>
-                <w:sz w:val="20"/>
-                <w:szCs w:val="20"/>
-              </w:rPr>
-              <w:t>polychoric</w:t>
-            </w:r>
-            <w:proofErr w:type="spellEnd"/>
-            <w:r>
-              <w:rPr>
-                <w:rFonts w:ascii="Arial" w:hAnsi="Arial" w:cs="Arial"/>
-                <w:color w:val="000000"/>
-                <w:sz w:val="20"/>
-                <w:szCs w:val="20"/>
-              </w:rPr>
-              <w:t xml:space="preserve"> clustering, and additional simulation studies demonstrating that this survey-weighting problem extends to other major causal discovery algorithms (PC, FCI, and </w:t>
-            </w:r>
-            <w:proofErr w:type="spellStart"/>
-            <w:r>
-              <w:rPr>
-                <w:rFonts w:ascii="Arial" w:hAnsi="Arial" w:cs="Arial"/>
-                <w:color w:val="000000"/>
-                <w:sz w:val="20"/>
-                <w:szCs w:val="20"/>
-              </w:rPr>
-              <w:t>LiNGAM</w:t>
-            </w:r>
-            <w:proofErr w:type="spellEnd"/>
-            <w:r>
-              <w:rPr>
-                <w:rFonts w:ascii="Arial" w:hAnsi="Arial" w:cs="Arial"/>
-                <w:color w:val="000000"/>
-                <w:sz w:val="20"/>
-                <w:szCs w:val="20"/>
-              </w:rPr>
-              <w:t>).</w:t>
+              <w:t>The CAHPS dataset has appeared in three recent companion publications (</w:t>
+            </w:r>
+            <w:r>
+              <w:rPr>
+                <w:rFonts w:ascii="Arial" w:hAnsi="Arial" w:cs="Arial"/>
+                <w:color w:val="000000"/>
+                <w:sz w:val="20"/>
+                <w:szCs w:val="20"/>
+                <w:u w:val="single"/>
+              </w:rPr>
+              <w:t xml:space="preserve">Frank et al. 2025, </w:t>
+            </w:r>
+            <w:r>
+              <w:rPr>
+                <w:rFonts w:ascii="Arial" w:hAnsi="Arial" w:cs="Arial"/>
+                <w:color w:val="000000"/>
+                <w:sz w:val="20"/>
+                <w:szCs w:val="20"/>
+                <w:u w:val="single"/>
+              </w:rPr>
+              <w:t>J</w:t>
+            </w:r>
+            <w:r>
+              <w:rPr>
+                <w:rFonts w:ascii="Arial" w:hAnsi="Arial" w:cs="Arial"/>
+                <w:color w:val="000000"/>
+                <w:sz w:val="20"/>
+                <w:szCs w:val="20"/>
+                <w:u w:val="single"/>
+              </w:rPr>
+              <w:t>AMA Health Forum; Lamba et al. 2025, JAMA Network Open; Russell et al. 2026, JAMA Network Open</w:t>
+            </w:r>
+            <w:r>
+              <w:rPr>
+                <w:rFonts w:ascii="Arial" w:hAnsi="Arial" w:cs="Arial"/>
+                <w:color w:val="000000"/>
+                <w:sz w:val="20"/>
+                <w:szCs w:val="20"/>
+              </w:rPr>
+              <w:t>), of which I am a co-author on the latter two. Those analyses used associational methods to characterize prevalence and risk-need concordance across demographic strata; the present paper develops new methodology and addresses different scientific questions about causal structure among social need domains. There is no analytic or textual overlap.</w:t>
             </w:r>
           </w:p>
           <w:p>
@@ -562,67 +457,7 @@
                 <w:sz w:val="20"/>
                 <w:szCs w:val="20"/>
               </w:rPr>
-              <w:t>Regarding data availability, the raw data used in this study </w:t>
-            </w:r>
-            <w:r>
-              <w:rPr>
-                <w:rFonts w:ascii="Arial" w:hAnsi="Arial" w:cs="Arial"/>
-                <w:b/>
-                <w:bCs/>
-                <w:color w:val="000000"/>
-                <w:sz w:val="20"/>
-                <w:szCs w:val="20"/>
-              </w:rPr>
-              <w:t>cannot be made publicly available due to Veterans Health Administration (VHA) privacy concerns</w:t>
-            </w:r>
-            <w:r>
-              <w:rPr>
-                <w:rFonts w:ascii="Arial" w:hAnsi="Arial" w:cs="Arial"/>
-                <w:color w:val="000000"/>
-                <w:sz w:val="20"/>
-                <w:szCs w:val="20"/>
-              </w:rPr>
-              <w:t>. However, to ensure methodological transparency, </w:t>
-            </w:r>
-            <w:r>
-              <w:rPr>
-                <w:rFonts w:ascii="Arial" w:hAnsi="Arial" w:cs="Arial"/>
-                <w:b/>
-                <w:bCs/>
-                <w:color w:val="000000"/>
-                <w:sz w:val="20"/>
-                <w:szCs w:val="20"/>
-              </w:rPr>
-              <w:t>all code used for our analyses</w:t>
-            </w:r>
-            <w:r>
-              <w:rPr>
-                <w:rFonts w:ascii="Arial" w:hAnsi="Arial" w:cs="Arial"/>
-                <w:color w:val="000000"/>
-                <w:sz w:val="20"/>
-                <w:szCs w:val="20"/>
-              </w:rPr>
-              <w:t>, alongside the fully reproducible simulation studies, </w:t>
-            </w:r>
-            <w:r>
-              <w:rPr>
-                <w:rFonts w:ascii="Arial" w:hAnsi="Arial" w:cs="Arial"/>
-                <w:b/>
-                <w:bCs/>
-                <w:color w:val="000000"/>
-                <w:sz w:val="20"/>
-                <w:szCs w:val="20"/>
-              </w:rPr>
-              <w:t>will be made openly available</w:t>
-            </w:r>
-            <w:r>
-              <w:rPr>
-                <w:rFonts w:ascii="Arial" w:hAnsi="Arial" w:cs="Arial"/>
-                <w:color w:val="000000"/>
-                <w:sz w:val="20"/>
-                <w:szCs w:val="20"/>
-              </w:rPr>
-              <w:t>.</w:t>
+              <w:t>Regarding reproducibility: the raw CAHPS data cannot be made publicly available due to VHA privacy restrictions, but all analysis code and fully reproducible simulation studies will be released openly.</w:t>
             </w:r>
           </w:p>
           <w:p>
@@ -657,7 +492,7 @@
                 <w:sz w:val="20"/>
                 <w:szCs w:val="20"/>
               </w:rPr>
-              <w:t>This manuscript is original, has not been published elsewhere, and is not currently under consideration by another journal. Thank you for your time and consideration.</w:t>
+              <w:t>This manuscript is original, has not been published elsewhere, and is not under consideration by another journal. Thank you for your time and consideration.</w:t>
             </w:r>
           </w:p>
           <w:p>
@@ -742,19 +577,6 @@
                 </wp:inline>
               </w:drawing>
             </w:r>
-          </w:p>
-          <w:p>
-            <w:pPr>
-              <w:pStyle w:val="whitespace-normal"/>
-              <w:spacing w:before="0" w:beforeAutospacing="0" w:after="0" w:afterAutospacing="0"/>
-              <w:jc w:val="both"/>
-              <w:rPr>
-                <w:rFonts w:ascii="Arial" w:hAnsi="Arial" w:cs="Arial"/>
-                <w:color w:val="000000"/>
-                <w:sz w:val="20"/>
-                <w:szCs w:val="20"/>
-              </w:rPr>
-            </w:pPr>
           </w:p>
           <w:p>
             <w:pPr>
@@ -3952,6 +3774,7 @@
   <w:style w:type="character" w:default="1" w:styleId="DefaultParagraphFont">
     <w:name w:val="Default Paragraph Font"/>
     <w:uiPriority w:val="1"/>
+    <w:semiHidden/>
     <w:unhideWhenUsed/>
   </w:style>
   <w:style w:type="table" w:default="1" w:styleId="TableNormal">

</xml_diff>

<commit_message>
getting ready for submission.
</commit_message>
<xml_diff>
--- a/inst/submission/01_cover.docx
+++ b/inst/submission/01_cover.docx
@@ -1,6 +1,6 @@
 
 <file path=word/document.xml><?xml version="1.0" encoding="utf-8"?>
-<w:document xmlns:wpc="http://schemas.microsoft.com/office/word/2010/wordprocessingCanvas" xmlns:cx="http://schemas.microsoft.com/office/drawing/2014/chartex" xmlns:cx1="http://schemas.microsoft.com/office/drawing/2015/9/8/chartex" xmlns:cx2="http://schemas.microsoft.com/office/drawing/2015/10/21/chartex" xmlns:cx3="http://schemas.microsoft.com/office/drawing/2016/5/9/chartex" xmlns:cx4="http://schemas.microsoft.com/office/drawing/2016/5/10/chartex" xmlns:cx5="http://schemas.microsoft.com/office/drawing/2016/5/11/chartex" xmlns:cx6="http://schemas.microsoft.com/office/drawing/2016/5/12/chartex" xmlns:cx7="http://schemas.microsoft.com/office/drawing/2016/5/13/chartex" xmlns:cx8="http://schemas.microsoft.com/office/drawing/2016/5/14/chartex" xmlns:mc="http://schemas.openxmlformats.org/markup-compatibility/2006" xmlns:aink="http://schemas.microsoft.com/office/drawing/2016/ink" xmlns:am3d="http://schemas.microsoft.com/office/drawing/2017/model3d" xmlns:o="urn:schemas-microsoft-com:office:office" xmlns:oel="http://schemas.microsoft.com/office/2019/extlst" xmlns:r="http://schemas.openxmlformats.org/officeDocument/2006/relationships" xmlns:m="http://schemas.openxmlformats.org/officeDocument/2006/math" xmlns:v="urn:schemas-microsoft-com:vml" xmlns:wp14="http://schemas.microsoft.com/office/word/2010/wordprocessingDrawing" xmlns:wp="http://schemas.openxmlformats.org/drawingml/2006/wordprocessingDrawing" xmlns:w10="urn:schemas-microsoft-com:office:word" xmlns:w="http://schemas.openxmlformats.org/wordprocessingml/2006/main" xmlns:w14="http://schemas.microsoft.com/office/word/2010/wordml" xmlns:w15="http://schemas.microsoft.com/office/word/2012/wordml" xmlns:w16cex="http://schemas.microsoft.com/office/word/2018/wordml/cex" xmlns:w16cid="http://schemas.microsoft.com/office/word/2016/wordml/cid" xmlns:w16="http://schemas.microsoft.com/office/word/2018/wordml" xmlns:w16du="http://schemas.microsoft.com/office/word/2023/wordml/word16du" xmlns:w16sdtdh="http://schemas.microsoft.com/office/word/2020/wordml/sdtdatahash" xmlns:w16se="http://schemas.microsoft.com/office/word/2015/wordml/symex" xmlns:wpg="http://schemas.microsoft.com/office/word/2010/wordprocessingGroup" xmlns:wpi="http://schemas.microsoft.com/office/word/2010/wordprocessingInk" xmlns:wne="http://schemas.microsoft.com/office/word/2006/wordml" xmlns:wps="http://schemas.microsoft.com/office/word/2010/wordprocessingShape" mc:Ignorable="w14 w15 w16se w16cid w16 w16cex w16sdtdh w16du wp14">
+<w:document xmlns:wpc="http://schemas.microsoft.com/office/word/2010/wordprocessingCanvas" xmlns:cx="http://schemas.microsoft.com/office/drawing/2014/chartex" xmlns:cx1="http://schemas.microsoft.com/office/drawing/2015/9/8/chartex" xmlns:cx2="http://schemas.microsoft.com/office/drawing/2015/10/21/chartex" xmlns:cx3="http://schemas.microsoft.com/office/drawing/2016/5/9/chartex" xmlns:cx4="http://schemas.microsoft.com/office/drawing/2016/5/10/chartex" xmlns:cx5="http://schemas.microsoft.com/office/drawing/2016/5/11/chartex" xmlns:cx6="http://schemas.microsoft.com/office/drawing/2016/5/12/chartex" xmlns:cx7="http://schemas.microsoft.com/office/drawing/2016/5/13/chartex" xmlns:cx8="http://schemas.microsoft.com/office/drawing/2016/5/14/chartex" xmlns:mc="http://schemas.openxmlformats.org/markup-compatibility/2006" xmlns:aink="http://schemas.microsoft.com/office/drawing/2016/ink" xmlns:am3d="http://schemas.microsoft.com/office/drawing/2017/model3d" xmlns:o="urn:schemas-microsoft-com:office:office" xmlns:oel="http://schemas.microsoft.com/office/2019/extlst" xmlns:r="http://schemas.openxmlformats.org/officeDocument/2006/relationships" xmlns:m="http://schemas.openxmlformats.org/officeDocument/2006/math" xmlns:v="urn:schemas-microsoft-com:vml" xmlns:wp14="http://schemas.microsoft.com/office/word/2010/wordprocessingDrawing" xmlns:wp="http://schemas.openxmlformats.org/drawingml/2006/wordprocessingDrawing" xmlns:w10="urn:schemas-microsoft-com:office:word" xmlns:w="http://schemas.openxmlformats.org/wordprocessingml/2006/main" xmlns:w14="http://schemas.microsoft.com/office/word/2010/wordml" xmlns:w15="http://schemas.microsoft.com/office/word/2012/wordml" xmlns:w16cex="http://schemas.microsoft.com/office/word/2018/wordml/cex" xmlns:w16cid="http://schemas.microsoft.com/office/word/2016/wordml/cid" xmlns:w16="http://schemas.microsoft.com/office/word/2018/wordml" xmlns:w16du="http://schemas.microsoft.com/office/word/2023/wordml/word16du" xmlns:w16sdtdh="http://schemas.microsoft.com/office/word/2020/wordml/sdtdatahash" xmlns:w16sdtfl="http://schemas.microsoft.com/office/word/2024/wordml/sdtformatlock" xmlns:w16se="http://schemas.microsoft.com/office/word/2015/wordml/symex" xmlns:wpg="http://schemas.microsoft.com/office/word/2010/wordprocessingGroup" xmlns:wpi="http://schemas.microsoft.com/office/word/2010/wordprocessingInk" xmlns:wne="http://schemas.microsoft.com/office/word/2006/wordml" xmlns:wps="http://schemas.microsoft.com/office/word/2010/wordprocessingShape" mc:Ignorable="w14 w15 w16se w16cid w16 w16cex w16sdtdh w16sdtfl w16du wp14">
   <w:body>
     <w:tbl>
       <w:tblPr>
@@ -18,7 +18,7 @@
       </w:tblGrid>
       <w:tr>
         <w:trPr>
-          <w:trHeight w:val="12509"/>
+          <w:trHeight w:val="11215"/>
         </w:trPr>
         <w:tc>
           <w:tcPr>
@@ -31,6 +31,47 @@
             <w:pPr>
               <w:pStyle w:val="whitespace-normal"/>
               <w:spacing w:before="0" w:beforeAutospacing="0" w:after="0" w:afterAutospacing="0"/>
+              <w:jc w:val="right"/>
+              <w:rPr>
+                <w:rFonts w:ascii="Arial" w:hAnsi="Arial" w:cs="Arial"/>
+                <w:color w:val="000000"/>
+                <w:sz w:val="20"/>
+                <w:szCs w:val="20"/>
+              </w:rPr>
+            </w:pPr>
+            <w:r>
+              <w:rPr>
+                <w:rFonts w:ascii="Arial" w:hAnsi="Arial" w:cs="Arial"/>
+                <w:color w:val="000000"/>
+                <w:sz w:val="20"/>
+                <w:szCs w:val="20"/>
+              </w:rPr>
+              <w:t>May 11</w:t>
+            </w:r>
+            <w:r>
+              <w:rPr>
+                <w:rFonts w:ascii="Arial" w:hAnsi="Arial" w:cs="Arial"/>
+                <w:color w:val="000000"/>
+                <w:sz w:val="20"/>
+                <w:szCs w:val="20"/>
+                <w:vertAlign w:val="superscript"/>
+              </w:rPr>
+              <w:t>th</w:t>
+            </w:r>
+            <w:r>
+              <w:rPr>
+                <w:rFonts w:ascii="Arial" w:hAnsi="Arial" w:cs="Arial"/>
+                <w:color w:val="000000"/>
+                <w:sz w:val="20"/>
+                <w:szCs w:val="20"/>
+              </w:rPr>
+              <w:t>, 2026</w:t>
+            </w:r>
+          </w:p>
+          <w:p>
+            <w:pPr>
+              <w:pStyle w:val="whitespace-normal"/>
+              <w:spacing w:before="0" w:beforeAutospacing="0" w:after="0" w:afterAutospacing="0"/>
               <w:jc w:val="both"/>
               <w:rPr>
                 <w:rFonts w:ascii="Arial" w:hAnsi="Arial" w:cs="Arial"/>
@@ -46,7 +87,16 @@
                 <w:sz w:val="20"/>
                 <w:szCs w:val="20"/>
               </w:rPr>
-              <w:t>Dear Editor,</w:t>
+              <w:t>D</w:t>
+            </w:r>
+            <w:r>
+              <w:rPr>
+                <w:rFonts w:ascii="Arial" w:hAnsi="Arial" w:cs="Arial"/>
+                <w:color w:val="000000"/>
+                <w:sz w:val="20"/>
+                <w:szCs w:val="20"/>
+              </w:rPr>
+              <w:t>ear Editor,</w:t>
             </w:r>
           </w:p>
           <w:p>
@@ -81,7 +131,16 @@
                 <w:sz w:val="20"/>
                 <w:szCs w:val="20"/>
               </w:rPr>
-              <w:t>We are pleased to submit our manuscript, "</w:t>
+              <w:t>I am</w:t>
+            </w:r>
+            <w:r>
+              <w:rPr>
+                <w:rFonts w:ascii="Arial" w:hAnsi="Arial" w:cs="Arial"/>
+                <w:color w:val="000000"/>
+                <w:sz w:val="20"/>
+                <w:szCs w:val="20"/>
+              </w:rPr>
+              <w:t xml:space="preserve"> pleased to submit our manuscript, "</w:t>
             </w:r>
             <w:r>
               <w:rPr>
@@ -92,7 +151,51 @@
                 <w:sz w:val="20"/>
                 <w:szCs w:val="20"/>
               </w:rPr>
-              <w:t>Survey-Weighted Ordinal Causal Discovery: Application to Veteran Social Needs, Mental Health, and Well-Being</w:t>
+              <w:t xml:space="preserve">Survey-Weighted Ordinal Causal Discovery: Application </w:t>
+            </w:r>
+            <w:r>
+              <w:rPr>
+                <w:rFonts w:ascii="Arial" w:hAnsi="Arial" w:cs="Arial"/>
+                <w:b/>
+                <w:bCs/>
+                <w:color w:val="000000"/>
+                <w:sz w:val="20"/>
+                <w:szCs w:val="20"/>
+              </w:rPr>
+              <w:t>t</w:t>
+            </w:r>
+            <w:r>
+              <w:rPr>
+                <w:rFonts w:ascii="Arial" w:hAnsi="Arial" w:cs="Arial"/>
+                <w:b/>
+                <w:bCs/>
+                <w:color w:val="000000"/>
+                <w:sz w:val="20"/>
+                <w:szCs w:val="20"/>
+              </w:rPr>
+              <w:t xml:space="preserve">o Veteran Social Needs </w:t>
+            </w:r>
+            <w:r>
+              <w:rPr>
+                <w:rFonts w:ascii="Arial" w:hAnsi="Arial" w:cs="Arial"/>
+                <w:b/>
+                <w:bCs/>
+                <w:color w:val="000000"/>
+                <w:sz w:val="20"/>
+                <w:szCs w:val="20"/>
+              </w:rPr>
+              <w:t>a</w:t>
+            </w:r>
+            <w:r>
+              <w:rPr>
+                <w:rFonts w:ascii="Arial" w:hAnsi="Arial" w:cs="Arial"/>
+                <w:b/>
+                <w:bCs/>
+                <w:color w:val="000000"/>
+                <w:sz w:val="20"/>
+                <w:szCs w:val="20"/>
+              </w:rPr>
+              <w:t>nd Health Indicators</w:t>
             </w:r>
             <w:r>
               <w:rPr>
@@ -273,7 +376,53 @@
                 <w:sz w:val="20"/>
                 <w:szCs w:val="20"/>
               </w:rPr>
-              <w:t xml:space="preserve"> The method integrates Horvitz-Thompson weights and Kish's effective sample size into a pseudo-BIC scoring framework, accommodates exogenous covariate adjustment without expanding the search space, presents two scoring variants (single-BIC and split-BIC) with a regime-based selection rule for heterogeneous ordinal scales, and supports structural constraints from domain knowledge. We prove that the framework consistently recovers the true population-level causal graph under a joint superpopulation-and-design asymptotic framework.</w:t>
+              <w:t xml:space="preserve"> The method integrates Horvitz-Thompson weights and Kish's effective sample size into a pseudo-BIC scoring framework, accommodates exogenous covariate adjustment without expanding the search space, </w:t>
+            </w:r>
+            <w:r>
+              <w:rPr>
+                <w:rFonts w:ascii="Arial" w:hAnsi="Arial" w:cs="Arial"/>
+                <w:color w:val="000000"/>
+                <w:sz w:val="20"/>
+                <w:szCs w:val="20"/>
+              </w:rPr>
+              <w:t>introduces a split-BIC scoring procedure that decouples skeleton control from edge orientation under heterogeneous ordinal scales, and supports structural constraints from domain knowledg</w:t>
+            </w:r>
+            <w:r>
+              <w:rPr>
+                <w:rFonts w:ascii="Arial" w:hAnsi="Arial" w:cs="Arial"/>
+                <w:color w:val="000000"/>
+                <w:sz w:val="20"/>
+                <w:szCs w:val="20"/>
+              </w:rPr>
+              <w:t>e</w:t>
+            </w:r>
+            <w:r>
+              <w:rPr>
+                <w:rFonts w:ascii="Arial" w:hAnsi="Arial" w:cs="Arial"/>
+                <w:color w:val="000000"/>
+                <w:sz w:val="20"/>
+                <w:szCs w:val="20"/>
+              </w:rPr>
+              <w:t xml:space="preserve">. We prove that the </w:t>
+            </w:r>
+            <w:r>
+              <w:rPr>
+                <w:rFonts w:ascii="Arial" w:hAnsi="Arial" w:cs="Arial"/>
+                <w:color w:val="000000"/>
+                <w:sz w:val="20"/>
+                <w:szCs w:val="20"/>
+                <w:u w:val="single"/>
+              </w:rPr>
+              <w:t>framework consistently recovers the true population-level causal graph under a joint superpopulation-and-design asymptotic framework</w:t>
+            </w:r>
+            <w:r>
+              <w:rPr>
+                <w:rFonts w:ascii="Arial" w:hAnsi="Arial" w:cs="Arial"/>
+                <w:color w:val="000000"/>
+                <w:sz w:val="20"/>
+                <w:szCs w:val="20"/>
+              </w:rPr>
+              <w:t>.</w:t>
             </w:r>
           </w:p>
           <w:p>
@@ -328,7 +477,324 @@
                 <w:sz w:val="20"/>
                 <w:szCs w:val="20"/>
               </w:rPr>
-              <w:t xml:space="preserve"> to national VA CAHPS survey data to map the causal architecture of social determinants of health among U.S. Veterans. The weighted analysis identifies unmet basic needs as the upstream causal hub, with discrimination and isolation serving as proximal mediators to mental health and well-being. An unweighted analysis of the same data places discrimination upstream of material deprivation — a qualitatively different and, under the stated assumptions, incorrect causal ordering. Complementary simulations confirm that the survey-weighting problem extends to other algorithm families (PC, FCI, </w:t>
+              <w:t xml:space="preserve"> to national </w:t>
+            </w:r>
+            <w:r>
+              <w:rPr>
+                <w:rFonts w:ascii="Arial" w:hAnsi="Arial" w:cs="Arial"/>
+                <w:color w:val="000000"/>
+                <w:sz w:val="20"/>
+                <w:szCs w:val="20"/>
+              </w:rPr>
+              <w:t xml:space="preserve">data collected from the </w:t>
+            </w:r>
+            <w:r>
+              <w:rPr>
+                <w:rFonts w:ascii="Arial" w:hAnsi="Arial" w:cs="Arial"/>
+                <w:b/>
+                <w:bCs/>
+                <w:color w:val="000000"/>
+                <w:sz w:val="20"/>
+                <w:szCs w:val="20"/>
+              </w:rPr>
+              <w:t xml:space="preserve">US Department of </w:t>
+            </w:r>
+            <w:r>
+              <w:rPr>
+                <w:rFonts w:ascii="Arial" w:hAnsi="Arial" w:cs="Arial"/>
+                <w:b/>
+                <w:bCs/>
+                <w:color w:val="000000"/>
+                <w:sz w:val="20"/>
+                <w:szCs w:val="20"/>
+              </w:rPr>
+              <w:t>V</w:t>
+            </w:r>
+            <w:r>
+              <w:rPr>
+                <w:rFonts w:ascii="Arial" w:hAnsi="Arial" w:cs="Arial"/>
+                <w:b/>
+                <w:bCs/>
+                <w:color w:val="000000"/>
+                <w:sz w:val="20"/>
+                <w:szCs w:val="20"/>
+              </w:rPr>
+              <w:t xml:space="preserve">eterans </w:t>
+            </w:r>
+            <w:r>
+              <w:rPr>
+                <w:rFonts w:ascii="Arial" w:hAnsi="Arial" w:cs="Arial"/>
+                <w:b/>
+                <w:bCs/>
+                <w:color w:val="000000"/>
+                <w:sz w:val="20"/>
+                <w:szCs w:val="20"/>
+              </w:rPr>
+              <w:t>A</w:t>
+            </w:r>
+            <w:r>
+              <w:rPr>
+                <w:rFonts w:ascii="Arial" w:hAnsi="Arial" w:cs="Arial"/>
+                <w:b/>
+                <w:bCs/>
+                <w:color w:val="000000"/>
+                <w:sz w:val="20"/>
+                <w:szCs w:val="20"/>
+              </w:rPr>
+              <w:t>ffairs (VA)</w:t>
+            </w:r>
+            <w:r>
+              <w:rPr>
+                <w:rFonts w:ascii="Arial" w:hAnsi="Arial" w:cs="Arial"/>
+                <w:b/>
+                <w:bCs/>
+                <w:color w:val="000000"/>
+                <w:sz w:val="20"/>
+                <w:szCs w:val="20"/>
+              </w:rPr>
+              <w:t xml:space="preserve"> </w:t>
+            </w:r>
+            <w:r>
+              <w:rPr>
+                <w:rFonts w:ascii="Arial" w:hAnsi="Arial" w:cs="Arial"/>
+                <w:b/>
+                <w:bCs/>
+                <w:color w:val="000000"/>
+                <w:sz w:val="20"/>
+                <w:szCs w:val="20"/>
+              </w:rPr>
+              <w:t>Survey of Healthcare Experience</w:t>
+            </w:r>
+            <w:r>
+              <w:rPr>
+                <w:rFonts w:ascii="Arial" w:hAnsi="Arial" w:cs="Arial"/>
+                <w:b/>
+                <w:bCs/>
+                <w:color w:val="000000"/>
+                <w:sz w:val="20"/>
+                <w:szCs w:val="20"/>
+              </w:rPr>
+              <w:t>s</w:t>
+            </w:r>
+            <w:r>
+              <w:rPr>
+                <w:rFonts w:ascii="Arial" w:hAnsi="Arial" w:cs="Arial"/>
+                <w:b/>
+                <w:bCs/>
+                <w:color w:val="000000"/>
+                <w:sz w:val="20"/>
+                <w:szCs w:val="20"/>
+              </w:rPr>
+              <w:t xml:space="preserve"> of Patients</w:t>
+            </w:r>
+            <w:r>
+              <w:rPr>
+                <w:rFonts w:ascii="Arial" w:hAnsi="Arial" w:cs="Arial"/>
+                <w:b/>
+                <w:bCs/>
+                <w:color w:val="000000"/>
+                <w:sz w:val="20"/>
+                <w:szCs w:val="20"/>
+              </w:rPr>
+              <w:t xml:space="preserve"> </w:t>
+            </w:r>
+            <w:r>
+              <w:rPr>
+                <w:rFonts w:ascii="Arial" w:hAnsi="Arial" w:cs="Arial"/>
+                <w:b/>
+                <w:bCs/>
+                <w:color w:val="000000"/>
+                <w:sz w:val="20"/>
+                <w:szCs w:val="20"/>
+              </w:rPr>
+              <w:t>(SHEP)</w:t>
+            </w:r>
+            <w:r>
+              <w:rPr>
+                <w:rFonts w:ascii="Arial" w:hAnsi="Arial" w:cs="Arial"/>
+                <w:color w:val="000000"/>
+                <w:sz w:val="20"/>
+                <w:szCs w:val="20"/>
+              </w:rPr>
+              <w:t xml:space="preserve"> </w:t>
+            </w:r>
+            <w:r>
+              <w:rPr>
+                <w:rFonts w:ascii="Arial" w:hAnsi="Arial" w:cs="Arial"/>
+                <w:b/>
+                <w:bCs/>
+                <w:color w:val="000000"/>
+                <w:sz w:val="20"/>
+                <w:szCs w:val="20"/>
+              </w:rPr>
+              <w:t xml:space="preserve">to map the causal architecture of social </w:t>
+            </w:r>
+            <w:r>
+              <w:rPr>
+                <w:rFonts w:ascii="Arial" w:hAnsi="Arial" w:cs="Arial"/>
+                <w:b/>
+                <w:bCs/>
+                <w:color w:val="000000"/>
+                <w:sz w:val="20"/>
+                <w:szCs w:val="20"/>
+              </w:rPr>
+              <w:t>needs</w:t>
+            </w:r>
+            <w:r>
+              <w:rPr>
+                <w:rFonts w:ascii="Arial" w:hAnsi="Arial" w:cs="Arial"/>
+                <w:b/>
+                <w:bCs/>
+                <w:color w:val="000000"/>
+                <w:sz w:val="20"/>
+                <w:szCs w:val="20"/>
+              </w:rPr>
+              <w:t xml:space="preserve"> among U.S. Veterans</w:t>
+            </w:r>
+            <w:r>
+              <w:rPr>
+                <w:rFonts w:ascii="Arial" w:hAnsi="Arial" w:cs="Arial"/>
+                <w:color w:val="000000"/>
+                <w:sz w:val="20"/>
+                <w:szCs w:val="20"/>
+              </w:rPr>
+              <w:t xml:space="preserve">. The </w:t>
+            </w:r>
+            <w:r>
+              <w:rPr>
+                <w:rFonts w:ascii="Arial" w:hAnsi="Arial" w:cs="Arial"/>
+                <w:color w:val="000000"/>
+                <w:sz w:val="20"/>
+                <w:szCs w:val="20"/>
+                <w:u w:val="single"/>
+              </w:rPr>
+              <w:t>weighted analysis identifies basic needs as the upstream causal hub, with isolation</w:t>
+            </w:r>
+            <w:r>
+              <w:rPr>
+                <w:rFonts w:ascii="Arial" w:hAnsi="Arial" w:cs="Arial"/>
+                <w:color w:val="000000"/>
+                <w:sz w:val="20"/>
+                <w:szCs w:val="20"/>
+                <w:u w:val="single"/>
+              </w:rPr>
+              <w:t>, loneliness, and discrimination</w:t>
+            </w:r>
+            <w:r>
+              <w:rPr>
+                <w:rFonts w:ascii="Arial" w:hAnsi="Arial" w:cs="Arial"/>
+                <w:color w:val="000000"/>
+                <w:sz w:val="20"/>
+                <w:szCs w:val="20"/>
+                <w:u w:val="single"/>
+              </w:rPr>
+              <w:t xml:space="preserve"> serving as proximal </w:t>
+            </w:r>
+            <w:r>
+              <w:rPr>
+                <w:rFonts w:ascii="Arial" w:hAnsi="Arial" w:cs="Arial"/>
+                <w:color w:val="000000"/>
+                <w:sz w:val="20"/>
+                <w:szCs w:val="20"/>
+                <w:u w:val="single"/>
+              </w:rPr>
+              <w:t>causes</w:t>
+            </w:r>
+            <w:r>
+              <w:rPr>
+                <w:rFonts w:ascii="Arial" w:hAnsi="Arial" w:cs="Arial"/>
+                <w:color w:val="000000"/>
+                <w:sz w:val="20"/>
+                <w:szCs w:val="20"/>
+                <w:u w:val="single"/>
+              </w:rPr>
+              <w:t xml:space="preserve"> </w:t>
+            </w:r>
+            <w:r>
+              <w:rPr>
+                <w:rFonts w:ascii="Arial" w:hAnsi="Arial" w:cs="Arial"/>
+                <w:color w:val="000000"/>
+                <w:sz w:val="20"/>
+                <w:szCs w:val="20"/>
+                <w:u w:val="single"/>
+              </w:rPr>
+              <w:t>for</w:t>
+            </w:r>
+            <w:r>
+              <w:rPr>
+                <w:rFonts w:ascii="Arial" w:hAnsi="Arial" w:cs="Arial"/>
+                <w:color w:val="000000"/>
+                <w:sz w:val="20"/>
+                <w:szCs w:val="20"/>
+                <w:u w:val="single"/>
+              </w:rPr>
+              <w:t xml:space="preserve"> mental health and well-being. An unweighted analysis of the same data places </w:t>
+            </w:r>
+            <w:r>
+              <w:rPr>
+                <w:rFonts w:ascii="Arial" w:hAnsi="Arial" w:cs="Arial"/>
+                <w:color w:val="000000"/>
+                <w:sz w:val="20"/>
+                <w:szCs w:val="20"/>
+                <w:u w:val="single"/>
+              </w:rPr>
+              <w:t xml:space="preserve">isolation, loneliness, and discrimination </w:t>
+            </w:r>
+            <w:r>
+              <w:rPr>
+                <w:rFonts w:ascii="Arial" w:hAnsi="Arial" w:cs="Arial"/>
+                <w:color w:val="000000"/>
+                <w:sz w:val="20"/>
+                <w:szCs w:val="20"/>
+                <w:u w:val="single"/>
+              </w:rPr>
+              <w:t xml:space="preserve">upstream of </w:t>
+            </w:r>
+            <w:r>
+              <w:rPr>
+                <w:rFonts w:ascii="Arial" w:hAnsi="Arial" w:cs="Arial"/>
+                <w:color w:val="000000"/>
+                <w:sz w:val="20"/>
+                <w:szCs w:val="20"/>
+                <w:u w:val="single"/>
+              </w:rPr>
+              <w:t>basic needs</w:t>
+            </w:r>
+            <w:r>
+              <w:rPr>
+                <w:rFonts w:ascii="Arial" w:hAnsi="Arial" w:cs="Arial"/>
+                <w:color w:val="000000"/>
+                <w:sz w:val="20"/>
+                <w:szCs w:val="20"/>
+              </w:rPr>
+              <w:t xml:space="preserve"> (</w:t>
+            </w:r>
+            <w:r>
+              <w:rPr>
+                <w:rFonts w:ascii="Arial" w:hAnsi="Arial" w:cs="Arial"/>
+                <w:color w:val="000000"/>
+                <w:sz w:val="20"/>
+                <w:szCs w:val="20"/>
+              </w:rPr>
+              <w:t>a qualitatively different and, under the stated assumptions, incorrect causal ordering</w:t>
+            </w:r>
+            <w:r>
+              <w:rPr>
+                <w:rFonts w:ascii="Arial" w:hAnsi="Arial" w:cs="Arial"/>
+                <w:color w:val="000000"/>
+                <w:sz w:val="20"/>
+                <w:szCs w:val="20"/>
+              </w:rPr>
+              <w:t>)</w:t>
+            </w:r>
+            <w:r>
+              <w:rPr>
+                <w:rFonts w:ascii="Arial" w:hAnsi="Arial" w:cs="Arial"/>
+                <w:color w:val="000000"/>
+                <w:sz w:val="20"/>
+                <w:szCs w:val="20"/>
+              </w:rPr>
+              <w:t xml:space="preserve">. Complementary simulations confirm that the survey-weighting problem extends to other algorithm families (PC, FCI, </w:t>
             </w:r>
             <w:proofErr w:type="spellStart"/>
             <w:r>
@@ -383,7 +849,25 @@
                 <w:sz w:val="20"/>
                 <w:szCs w:val="20"/>
               </w:rPr>
-              <w:t>The CAHPS dataset has appeared in three recent companion publications (</w:t>
+              <w:t xml:space="preserve">The </w:t>
+            </w:r>
+            <w:r>
+              <w:rPr>
+                <w:rFonts w:ascii="Arial" w:hAnsi="Arial" w:cs="Arial"/>
+                <w:color w:val="000000"/>
+                <w:sz w:val="20"/>
+                <w:szCs w:val="20"/>
+              </w:rPr>
+              <w:t>SHEP</w:t>
+            </w:r>
+            <w:r>
+              <w:rPr>
+                <w:rFonts w:ascii="Arial" w:hAnsi="Arial" w:cs="Arial"/>
+                <w:color w:val="000000"/>
+                <w:sz w:val="20"/>
+                <w:szCs w:val="20"/>
+              </w:rPr>
+              <w:t xml:space="preserve"> dataset has appeared in three recent companion publications (</w:t>
             </w:r>
             <w:r>
               <w:rPr>
@@ -428,7 +912,7 @@
           <w:p>
             <w:pPr>
               <w:pStyle w:val="whitespace-normal"/>
-              <w:spacing w:before="0" w:beforeAutospacing="0" w:after="0" w:afterAutospacing="0"/>
+              <w:spacing w:after="0"/>
               <w:jc w:val="both"/>
               <w:rPr>
                 <w:rFonts w:ascii="Arial" w:hAnsi="Arial" w:cs="Arial"/>
@@ -437,76 +921,83 @@
                 <w:szCs w:val="20"/>
               </w:rPr>
             </w:pPr>
-          </w:p>
-          <w:p>
-            <w:pPr>
-              <w:pStyle w:val="whitespace-normal"/>
-              <w:spacing w:before="0" w:beforeAutospacing="0" w:after="0" w:afterAutospacing="0"/>
-              <w:jc w:val="both"/>
-              <w:rPr>
-                <w:rFonts w:ascii="Arial" w:hAnsi="Arial" w:cs="Arial"/>
-                <w:color w:val="000000"/>
-                <w:sz w:val="20"/>
-                <w:szCs w:val="20"/>
-              </w:rPr>
-            </w:pPr>
-            <w:r>
-              <w:rPr>
-                <w:rFonts w:ascii="Arial" w:hAnsi="Arial" w:cs="Arial"/>
-                <w:color w:val="000000"/>
-                <w:sz w:val="20"/>
-                <w:szCs w:val="20"/>
-              </w:rPr>
-              <w:t>Regarding reproducibility: the raw CAHPS data cannot be made publicly available due to VHA privacy restrictions, but all analysis code and fully reproducible simulation studies will be released openly.</w:t>
-            </w:r>
-          </w:p>
-          <w:p>
-            <w:pPr>
-              <w:pStyle w:val="whitespace-normal"/>
-              <w:spacing w:before="0" w:beforeAutospacing="0" w:after="0" w:afterAutospacing="0"/>
-              <w:jc w:val="both"/>
-              <w:rPr>
-                <w:rFonts w:ascii="Arial" w:hAnsi="Arial" w:cs="Arial"/>
-                <w:color w:val="000000"/>
-                <w:sz w:val="20"/>
-                <w:szCs w:val="20"/>
-              </w:rPr>
-            </w:pPr>
-          </w:p>
-          <w:p>
-            <w:pPr>
-              <w:pStyle w:val="whitespace-normal"/>
-              <w:spacing w:before="0" w:beforeAutospacing="0" w:after="0" w:afterAutospacing="0"/>
-              <w:jc w:val="both"/>
-              <w:rPr>
-                <w:rFonts w:ascii="Arial" w:hAnsi="Arial" w:cs="Arial"/>
-                <w:color w:val="000000"/>
-                <w:sz w:val="20"/>
-                <w:szCs w:val="20"/>
-              </w:rPr>
-            </w:pPr>
-            <w:r>
-              <w:rPr>
-                <w:rFonts w:ascii="Arial" w:hAnsi="Arial" w:cs="Arial"/>
-                <w:color w:val="000000"/>
-                <w:sz w:val="20"/>
-                <w:szCs w:val="20"/>
-              </w:rPr>
-              <w:t>This manuscript is original, has not been published elsewhere, and is not under consideration by another journal. Thank you for your time and consideration.</w:t>
-            </w:r>
-          </w:p>
-          <w:p>
-            <w:pPr>
-              <w:pStyle w:val="whitespace-normal"/>
-              <w:spacing w:before="0" w:beforeAutospacing="0" w:after="0" w:afterAutospacing="0"/>
-              <w:jc w:val="both"/>
-              <w:rPr>
-                <w:rFonts w:ascii="Arial" w:hAnsi="Arial" w:cs="Arial"/>
-                <w:color w:val="000000"/>
-                <w:sz w:val="20"/>
-                <w:szCs w:val="20"/>
-              </w:rPr>
-            </w:pPr>
+            <w:r>
+              <w:rPr>
+                <w:rFonts w:ascii="Arial" w:hAnsi="Arial" w:cs="Arial"/>
+                <w:color w:val="000000"/>
+                <w:sz w:val="20"/>
+                <w:szCs w:val="20"/>
+              </w:rPr>
+              <w:t xml:space="preserve">Regarding reproducibility: the raw SHEP data cannot be made publicly available due to VA privacy restrictions. An R implementation of the proposed methodology, </w:t>
+            </w:r>
+            <w:r>
+              <w:rPr>
+                <w:rFonts w:ascii="Arial" w:hAnsi="Arial" w:cs="Arial"/>
+                <w:color w:val="000000"/>
+                <w:sz w:val="20"/>
+                <w:szCs w:val="20"/>
+              </w:rPr>
+              <w:t>the</w:t>
+            </w:r>
+            <w:r>
+              <w:rPr>
+                <w:rFonts w:ascii="Arial" w:hAnsi="Arial" w:cs="Arial"/>
+                <w:color w:val="000000"/>
+                <w:sz w:val="20"/>
+                <w:szCs w:val="20"/>
+              </w:rPr>
+              <w:t xml:space="preserve"> </w:t>
+            </w:r>
+            <w:hyperlink r:id="rId7" w:history="1">
+              <w:proofErr w:type="spellStart"/>
+              <w:r>
+                <w:rPr>
+                  <w:rStyle w:val="Hyperlink"/>
+                  <w:rFonts w:ascii="Arial" w:hAnsi="Arial" w:cs="Arial"/>
+                  <w:color w:val="0070C0"/>
+                  <w:sz w:val="20"/>
+                  <w:szCs w:val="20"/>
+                </w:rPr>
+                <w:t>swa-oBn</w:t>
+              </w:r>
+              <w:proofErr w:type="spellEnd"/>
+            </w:hyperlink>
+            <w:r>
+              <w:rPr>
+                <w:rFonts w:ascii="Arial" w:hAnsi="Arial" w:cs="Arial"/>
+                <w:color w:val="0070C0"/>
+                <w:sz w:val="20"/>
+                <w:szCs w:val="20"/>
+              </w:rPr>
+              <w:t xml:space="preserve"> </w:t>
+            </w:r>
+            <w:r>
+              <w:rPr>
+                <w:rFonts w:ascii="Arial" w:hAnsi="Arial" w:cs="Arial"/>
+                <w:color w:val="000000"/>
+                <w:sz w:val="20"/>
+                <w:szCs w:val="20"/>
+              </w:rPr>
+              <w:t>package</w:t>
+            </w:r>
+            <w:r>
+              <w:rPr>
+                <w:rFonts w:ascii="Arial" w:hAnsi="Arial" w:cs="Arial"/>
+                <w:color w:val="000000"/>
+                <w:sz w:val="20"/>
+                <w:szCs w:val="20"/>
+              </w:rPr>
+              <w:t>, is available online with full documentation, and we have uploaded all simulation code and the analysis pipeline as supplementary materials. This manuscript is original, has not been published elsewhere, and is not under consideration by another journal. Thank you for your time and consideration</w:t>
+            </w:r>
+            <w:r>
+              <w:rPr>
+                <w:rFonts w:ascii="Arial" w:hAnsi="Arial" w:cs="Arial"/>
+                <w:color w:val="000000"/>
+                <w:sz w:val="20"/>
+                <w:szCs w:val="20"/>
+              </w:rPr>
+              <w:t>.</w:t>
+            </w:r>
           </w:p>
           <w:p>
             <w:pPr>
@@ -545,7 +1036,13 @@
                 <wp:inline distT="0" distB="0" distL="0" distR="0" wp14:anchorId="6BB3AF59" wp14:editId="1F4D27FF">
                   <wp:extent cx="1557196" cy="325959"/>
                   <wp:effectExtent l="0" t="0" r="5080" b="4445"/>
-                  <wp:docPr id="1923514276" name="Picture 1" descr="A close-up of a name&#10;&#10;AI-generated content may be incorrect."/>
+                  <wp:docPr id="1923514276" name="Picture 1" descr="A close-up of a name&#10;&#10;AI-generated content may be incorrect.">
+                    <a:extLst xmlns:a="http://schemas.openxmlformats.org/drawingml/2006/main">
+                      <a:ext uri="{FF2B5EF4-FFF2-40B4-BE49-F238E27FC236}">
+                        <a16:creationId xmlns:a16="http://schemas.microsoft.com/office/drawing/2014/main" id="{076C5B90-737A-4CED-958A-115433C6C3A4}"/>
+                      </a:ext>
+                    </a:extLst>
+                  </wp:docPr>
                   <wp:cNvGraphicFramePr>
                     <a:graphicFrameLocks xmlns:a="http://schemas.openxmlformats.org/drawingml/2006/main" noChangeAspect="1"/>
                   </wp:cNvGraphicFramePr>
@@ -557,7 +1054,7 @@
                           <pic:cNvPicPr/>
                         </pic:nvPicPr>
                         <pic:blipFill>
-                          <a:blip r:embed="rId7"/>
+                          <a:blip r:embed="rId8"/>
                           <a:stretch>
                             <a:fillRect/>
                           </a:stretch>
@@ -607,7 +1104,6 @@
               <w:jc w:val="right"/>
               <w:rPr>
                 <w:rFonts w:ascii="Arial" w:hAnsi="Arial" w:cs="Arial"/>
-                <w:color w:val="000000"/>
                 <w:sz w:val="20"/>
                 <w:szCs w:val="20"/>
               </w:rPr>
@@ -621,40 +1117,6 @@
               </w:rPr>
               <w:t>Soumik Purkayastha</w:t>
             </w:r>
-            <w:r>
-              <w:rPr>
-                <w:rFonts w:ascii="Arial" w:hAnsi="Arial" w:cs="Arial"/>
-                <w:color w:val="000000"/>
-                <w:sz w:val="20"/>
-                <w:szCs w:val="20"/>
-              </w:rPr>
-              <w:t>.</w:t>
-            </w:r>
-          </w:p>
-          <w:p>
-            <w:pPr>
-              <w:pStyle w:val="whitespace-pre-wrap"/>
-              <w:spacing w:before="0" w:beforeAutospacing="0" w:after="0" w:afterAutospacing="0"/>
-              <w:jc w:val="right"/>
-              <w:rPr>
-                <w:rFonts w:ascii="Arial" w:hAnsi="Arial" w:cs="Arial"/>
-                <w:color w:val="000000"/>
-                <w:sz w:val="20"/>
-                <w:szCs w:val="20"/>
-              </w:rPr>
-            </w:pPr>
-          </w:p>
-          <w:p>
-            <w:pPr>
-              <w:pStyle w:val="whitespace-pre-wrap"/>
-              <w:spacing w:before="0" w:beforeAutospacing="0" w:after="0" w:afterAutospacing="0"/>
-              <w:jc w:val="right"/>
-              <w:rPr>
-                <w:rFonts w:ascii="Arial" w:hAnsi="Arial" w:cs="Arial"/>
-                <w:sz w:val="20"/>
-                <w:szCs w:val="20"/>
-              </w:rPr>
-            </w:pPr>
           </w:p>
         </w:tc>
         <w:tc>
@@ -1042,7 +1504,7 @@
       </w:pPr>
     </w:p>
     <w:sectPr>
-      <w:headerReference w:type="first" r:id="rId8"/>
+      <w:headerReference w:type="first" r:id="rId9"/>
       <w:pgSz w:w="12240" w:h="15840"/>
       <w:pgMar w:top="1008" w:right="1080" w:bottom="720" w:left="1080" w:header="576" w:footer="144" w:gutter="0"/>
       <w:cols w:space="432"/>
@@ -1054,7 +1516,7 @@
 </file>
 
 <file path=word/endnotes.xml><?xml version="1.0" encoding="utf-8"?>
-<w:endnotes xmlns:wpc="http://schemas.microsoft.com/office/word/2010/wordprocessingCanvas" xmlns:cx="http://schemas.microsoft.com/office/drawing/2014/chartex" xmlns:cx1="http://schemas.microsoft.com/office/drawing/2015/9/8/chartex" xmlns:cx2="http://schemas.microsoft.com/office/drawing/2015/10/21/chartex" xmlns:cx3="http://schemas.microsoft.com/office/drawing/2016/5/9/chartex" xmlns:cx4="http://schemas.microsoft.com/office/drawing/2016/5/10/chartex" xmlns:cx5="http://schemas.microsoft.com/office/drawing/2016/5/11/chartex" xmlns:cx6="http://schemas.microsoft.com/office/drawing/2016/5/12/chartex" xmlns:cx7="http://schemas.microsoft.com/office/drawing/2016/5/13/chartex" xmlns:cx8="http://schemas.microsoft.com/office/drawing/2016/5/14/chartex" xmlns:mc="http://schemas.openxmlformats.org/markup-compatibility/2006" xmlns:aink="http://schemas.microsoft.com/office/drawing/2016/ink" xmlns:am3d="http://schemas.microsoft.com/office/drawing/2017/model3d" xmlns:o="urn:schemas-microsoft-com:office:office" xmlns:oel="http://schemas.microsoft.com/office/2019/extlst" xmlns:r="http://schemas.openxmlformats.org/officeDocument/2006/relationships" xmlns:m="http://schemas.openxmlformats.org/officeDocument/2006/math" xmlns:v="urn:schemas-microsoft-com:vml" xmlns:wp14="http://schemas.microsoft.com/office/word/2010/wordprocessingDrawing" xmlns:wp="http://schemas.openxmlformats.org/drawingml/2006/wordprocessingDrawing" xmlns:w10="urn:schemas-microsoft-com:office:word" xmlns:w="http://schemas.openxmlformats.org/wordprocessingml/2006/main" xmlns:w14="http://schemas.microsoft.com/office/word/2010/wordml" xmlns:w15="http://schemas.microsoft.com/office/word/2012/wordml" xmlns:w16cex="http://schemas.microsoft.com/office/word/2018/wordml/cex" xmlns:w16cid="http://schemas.microsoft.com/office/word/2016/wordml/cid" xmlns:w16="http://schemas.microsoft.com/office/word/2018/wordml" xmlns:w16du="http://schemas.microsoft.com/office/word/2023/wordml/word16du" xmlns:w16sdtdh="http://schemas.microsoft.com/office/word/2020/wordml/sdtdatahash" xmlns:w16se="http://schemas.microsoft.com/office/word/2015/wordml/symex" xmlns:wpg="http://schemas.microsoft.com/office/word/2010/wordprocessingGroup" xmlns:wpi="http://schemas.microsoft.com/office/word/2010/wordprocessingInk" xmlns:wne="http://schemas.microsoft.com/office/word/2006/wordml" xmlns:wps="http://schemas.microsoft.com/office/word/2010/wordprocessingShape" mc:Ignorable="w14 w15 w16se w16cid w16 w16cex w16sdtdh w16du wp14">
+<w:endnotes xmlns:wpc="http://schemas.microsoft.com/office/word/2010/wordprocessingCanvas" xmlns:cx="http://schemas.microsoft.com/office/drawing/2014/chartex" xmlns:cx1="http://schemas.microsoft.com/office/drawing/2015/9/8/chartex" xmlns:cx2="http://schemas.microsoft.com/office/drawing/2015/10/21/chartex" xmlns:cx3="http://schemas.microsoft.com/office/drawing/2016/5/9/chartex" xmlns:cx4="http://schemas.microsoft.com/office/drawing/2016/5/10/chartex" xmlns:cx5="http://schemas.microsoft.com/office/drawing/2016/5/11/chartex" xmlns:cx6="http://schemas.microsoft.com/office/drawing/2016/5/12/chartex" xmlns:cx7="http://schemas.microsoft.com/office/drawing/2016/5/13/chartex" xmlns:cx8="http://schemas.microsoft.com/office/drawing/2016/5/14/chartex" xmlns:mc="http://schemas.openxmlformats.org/markup-compatibility/2006" xmlns:aink="http://schemas.microsoft.com/office/drawing/2016/ink" xmlns:am3d="http://schemas.microsoft.com/office/drawing/2017/model3d" xmlns:o="urn:schemas-microsoft-com:office:office" xmlns:oel="http://schemas.microsoft.com/office/2019/extlst" xmlns:r="http://schemas.openxmlformats.org/officeDocument/2006/relationships" xmlns:m="http://schemas.openxmlformats.org/officeDocument/2006/math" xmlns:v="urn:schemas-microsoft-com:vml" xmlns:wp14="http://schemas.microsoft.com/office/word/2010/wordprocessingDrawing" xmlns:wp="http://schemas.openxmlformats.org/drawingml/2006/wordprocessingDrawing" xmlns:w10="urn:schemas-microsoft-com:office:word" xmlns:w="http://schemas.openxmlformats.org/wordprocessingml/2006/main" xmlns:w14="http://schemas.microsoft.com/office/word/2010/wordml" xmlns:w15="http://schemas.microsoft.com/office/word/2012/wordml" xmlns:w16cex="http://schemas.microsoft.com/office/word/2018/wordml/cex" xmlns:w16cid="http://schemas.microsoft.com/office/word/2016/wordml/cid" xmlns:w16="http://schemas.microsoft.com/office/word/2018/wordml" xmlns:w16du="http://schemas.microsoft.com/office/word/2023/wordml/word16du" xmlns:w16sdtdh="http://schemas.microsoft.com/office/word/2020/wordml/sdtdatahash" xmlns:w16sdtfl="http://schemas.microsoft.com/office/word/2024/wordml/sdtformatlock" xmlns:w16se="http://schemas.microsoft.com/office/word/2015/wordml/symex" xmlns:wpg="http://schemas.microsoft.com/office/word/2010/wordprocessingGroup" xmlns:wpi="http://schemas.microsoft.com/office/word/2010/wordprocessingInk" xmlns:wne="http://schemas.microsoft.com/office/word/2006/wordml" xmlns:wps="http://schemas.microsoft.com/office/word/2010/wordprocessingShape" mc:Ignorable="w14 w15 w16se w16cid w16 w16cex w16sdtdh w16sdtfl w16du wp14">
   <w:endnote w:type="separator" w:id="-1">
     <w:p>
       <w:pPr>
@@ -1086,7 +1548,7 @@
 </file>
 
 <file path=word/footnotes.xml><?xml version="1.0" encoding="utf-8"?>
-<w:footnotes xmlns:wpc="http://schemas.microsoft.com/office/word/2010/wordprocessingCanvas" xmlns:cx="http://schemas.microsoft.com/office/drawing/2014/chartex" xmlns:cx1="http://schemas.microsoft.com/office/drawing/2015/9/8/chartex" xmlns:cx2="http://schemas.microsoft.com/office/drawing/2015/10/21/chartex" xmlns:cx3="http://schemas.microsoft.com/office/drawing/2016/5/9/chartex" xmlns:cx4="http://schemas.microsoft.com/office/drawing/2016/5/10/chartex" xmlns:cx5="http://schemas.microsoft.com/office/drawing/2016/5/11/chartex" xmlns:cx6="http://schemas.microsoft.com/office/drawing/2016/5/12/chartex" xmlns:cx7="http://schemas.microsoft.com/office/drawing/2016/5/13/chartex" xmlns:cx8="http://schemas.microsoft.com/office/drawing/2016/5/14/chartex" xmlns:mc="http://schemas.openxmlformats.org/markup-compatibility/2006" xmlns:aink="http://schemas.microsoft.com/office/drawing/2016/ink" xmlns:am3d="http://schemas.microsoft.com/office/drawing/2017/model3d" xmlns:o="urn:schemas-microsoft-com:office:office" xmlns:oel="http://schemas.microsoft.com/office/2019/extlst" xmlns:r="http://schemas.openxmlformats.org/officeDocument/2006/relationships" xmlns:m="http://schemas.openxmlformats.org/officeDocument/2006/math" xmlns:v="urn:schemas-microsoft-com:vml" xmlns:wp14="http://schemas.microsoft.com/office/word/2010/wordprocessingDrawing" xmlns:wp="http://schemas.openxmlformats.org/drawingml/2006/wordprocessingDrawing" xmlns:w10="urn:schemas-microsoft-com:office:word" xmlns:w="http://schemas.openxmlformats.org/wordprocessingml/2006/main" xmlns:w14="http://schemas.microsoft.com/office/word/2010/wordml" xmlns:w15="http://schemas.microsoft.com/office/word/2012/wordml" xmlns:w16cex="http://schemas.microsoft.com/office/word/2018/wordml/cex" xmlns:w16cid="http://schemas.microsoft.com/office/word/2016/wordml/cid" xmlns:w16="http://schemas.microsoft.com/office/word/2018/wordml" xmlns:w16du="http://schemas.microsoft.com/office/word/2023/wordml/word16du" xmlns:w16sdtdh="http://schemas.microsoft.com/office/word/2020/wordml/sdtdatahash" xmlns:w16se="http://schemas.microsoft.com/office/word/2015/wordml/symex" xmlns:wpg="http://schemas.microsoft.com/office/word/2010/wordprocessingGroup" xmlns:wpi="http://schemas.microsoft.com/office/word/2010/wordprocessingInk" xmlns:wne="http://schemas.microsoft.com/office/word/2006/wordml" xmlns:wps="http://schemas.microsoft.com/office/word/2010/wordprocessingShape" mc:Ignorable="w14 w15 w16se w16cid w16 w16cex w16sdtdh w16du wp14">
+<w:footnotes xmlns:wpc="http://schemas.microsoft.com/office/word/2010/wordprocessingCanvas" xmlns:cx="http://schemas.microsoft.com/office/drawing/2014/chartex" xmlns:cx1="http://schemas.microsoft.com/office/drawing/2015/9/8/chartex" xmlns:cx2="http://schemas.microsoft.com/office/drawing/2015/10/21/chartex" xmlns:cx3="http://schemas.microsoft.com/office/drawing/2016/5/9/chartex" xmlns:cx4="http://schemas.microsoft.com/office/drawing/2016/5/10/chartex" xmlns:cx5="http://schemas.microsoft.com/office/drawing/2016/5/11/chartex" xmlns:cx6="http://schemas.microsoft.com/office/drawing/2016/5/12/chartex" xmlns:cx7="http://schemas.microsoft.com/office/drawing/2016/5/13/chartex" xmlns:cx8="http://schemas.microsoft.com/office/drawing/2016/5/14/chartex" xmlns:mc="http://schemas.openxmlformats.org/markup-compatibility/2006" xmlns:aink="http://schemas.microsoft.com/office/drawing/2016/ink" xmlns:am3d="http://schemas.microsoft.com/office/drawing/2017/model3d" xmlns:o="urn:schemas-microsoft-com:office:office" xmlns:oel="http://schemas.microsoft.com/office/2019/extlst" xmlns:r="http://schemas.openxmlformats.org/officeDocument/2006/relationships" xmlns:m="http://schemas.openxmlformats.org/officeDocument/2006/math" xmlns:v="urn:schemas-microsoft-com:vml" xmlns:wp14="http://schemas.microsoft.com/office/word/2010/wordprocessingDrawing" xmlns:wp="http://schemas.openxmlformats.org/drawingml/2006/wordprocessingDrawing" xmlns:w10="urn:schemas-microsoft-com:office:word" xmlns:w="http://schemas.openxmlformats.org/wordprocessingml/2006/main" xmlns:w14="http://schemas.microsoft.com/office/word/2010/wordml" xmlns:w15="http://schemas.microsoft.com/office/word/2012/wordml" xmlns:w16cex="http://schemas.microsoft.com/office/word/2018/wordml/cex" xmlns:w16cid="http://schemas.microsoft.com/office/word/2016/wordml/cid" xmlns:w16="http://schemas.microsoft.com/office/word/2018/wordml" xmlns:w16du="http://schemas.microsoft.com/office/word/2023/wordml/word16du" xmlns:w16sdtdh="http://schemas.microsoft.com/office/word/2020/wordml/sdtdatahash" xmlns:w16sdtfl="http://schemas.microsoft.com/office/word/2024/wordml/sdtformatlock" xmlns:w16se="http://schemas.microsoft.com/office/word/2015/wordml/symex" xmlns:wpg="http://schemas.microsoft.com/office/word/2010/wordprocessingGroup" xmlns:wpi="http://schemas.microsoft.com/office/word/2010/wordprocessingInk" xmlns:wne="http://schemas.microsoft.com/office/word/2006/wordml" xmlns:wps="http://schemas.microsoft.com/office/word/2010/wordprocessingShape" mc:Ignorable="w14 w15 w16se w16cid w16 w16cex w16sdtdh w16sdtfl w16du wp14">
   <w:footnote w:type="separator" w:id="-1">
     <w:p>
       <w:pPr>
@@ -1118,7 +1580,7 @@
 </file>
 
 <file path=word/header1.xml><?xml version="1.0" encoding="utf-8"?>
-<w:hdr xmlns:wpc="http://schemas.microsoft.com/office/word/2010/wordprocessingCanvas" xmlns:cx="http://schemas.microsoft.com/office/drawing/2014/chartex" xmlns:cx1="http://schemas.microsoft.com/office/drawing/2015/9/8/chartex" xmlns:cx2="http://schemas.microsoft.com/office/drawing/2015/10/21/chartex" xmlns:cx3="http://schemas.microsoft.com/office/drawing/2016/5/9/chartex" xmlns:cx4="http://schemas.microsoft.com/office/drawing/2016/5/10/chartex" xmlns:cx5="http://schemas.microsoft.com/office/drawing/2016/5/11/chartex" xmlns:cx6="http://schemas.microsoft.com/office/drawing/2016/5/12/chartex" xmlns:cx7="http://schemas.microsoft.com/office/drawing/2016/5/13/chartex" xmlns:cx8="http://schemas.microsoft.com/office/drawing/2016/5/14/chartex" xmlns:mc="http://schemas.openxmlformats.org/markup-compatibility/2006" xmlns:aink="http://schemas.microsoft.com/office/drawing/2016/ink" xmlns:am3d="http://schemas.microsoft.com/office/drawing/2017/model3d" xmlns:o="urn:schemas-microsoft-com:office:office" xmlns:oel="http://schemas.microsoft.com/office/2019/extlst" xmlns:r="http://schemas.openxmlformats.org/officeDocument/2006/relationships" xmlns:m="http://schemas.openxmlformats.org/officeDocument/2006/math" xmlns:v="urn:schemas-microsoft-com:vml" xmlns:wp14="http://schemas.microsoft.com/office/word/2010/wordprocessingDrawing" xmlns:wp="http://schemas.openxmlformats.org/drawingml/2006/wordprocessingDrawing" xmlns:w10="urn:schemas-microsoft-com:office:word" xmlns:w="http://schemas.openxmlformats.org/wordprocessingml/2006/main" xmlns:w14="http://schemas.microsoft.com/office/word/2010/wordml" xmlns:w15="http://schemas.microsoft.com/office/word/2012/wordml" xmlns:w16cex="http://schemas.microsoft.com/office/word/2018/wordml/cex" xmlns:w16cid="http://schemas.microsoft.com/office/word/2016/wordml/cid" xmlns:w16="http://schemas.microsoft.com/office/word/2018/wordml" xmlns:w16du="http://schemas.microsoft.com/office/word/2023/wordml/word16du" xmlns:w16sdtdh="http://schemas.microsoft.com/office/word/2020/wordml/sdtdatahash" xmlns:w16se="http://schemas.microsoft.com/office/word/2015/wordml/symex" xmlns:wpg="http://schemas.microsoft.com/office/word/2010/wordprocessingGroup" xmlns:wpi="http://schemas.microsoft.com/office/word/2010/wordprocessingInk" xmlns:wne="http://schemas.microsoft.com/office/word/2006/wordml" xmlns:wps="http://schemas.microsoft.com/office/word/2010/wordprocessingShape" mc:Ignorable="w14 w15 w16se w16cid w16 w16cex w16sdtdh w16du wp14">
+<w:hdr xmlns:wpc="http://schemas.microsoft.com/office/word/2010/wordprocessingCanvas" xmlns:cx="http://schemas.microsoft.com/office/drawing/2014/chartex" xmlns:cx1="http://schemas.microsoft.com/office/drawing/2015/9/8/chartex" xmlns:cx2="http://schemas.microsoft.com/office/drawing/2015/10/21/chartex" xmlns:cx3="http://schemas.microsoft.com/office/drawing/2016/5/9/chartex" xmlns:cx4="http://schemas.microsoft.com/office/drawing/2016/5/10/chartex" xmlns:cx5="http://schemas.microsoft.com/office/drawing/2016/5/11/chartex" xmlns:cx6="http://schemas.microsoft.com/office/drawing/2016/5/12/chartex" xmlns:cx7="http://schemas.microsoft.com/office/drawing/2016/5/13/chartex" xmlns:cx8="http://schemas.microsoft.com/office/drawing/2016/5/14/chartex" xmlns:mc="http://schemas.openxmlformats.org/markup-compatibility/2006" xmlns:aink="http://schemas.microsoft.com/office/drawing/2016/ink" xmlns:am3d="http://schemas.microsoft.com/office/drawing/2017/model3d" xmlns:o="urn:schemas-microsoft-com:office:office" xmlns:oel="http://schemas.microsoft.com/office/2019/extlst" xmlns:r="http://schemas.openxmlformats.org/officeDocument/2006/relationships" xmlns:m="http://schemas.openxmlformats.org/officeDocument/2006/math" xmlns:v="urn:schemas-microsoft-com:vml" xmlns:wp14="http://schemas.microsoft.com/office/word/2010/wordprocessingDrawing" xmlns:wp="http://schemas.openxmlformats.org/drawingml/2006/wordprocessingDrawing" xmlns:w10="urn:schemas-microsoft-com:office:word" xmlns:w="http://schemas.openxmlformats.org/wordprocessingml/2006/main" xmlns:w14="http://schemas.microsoft.com/office/word/2010/wordml" xmlns:w15="http://schemas.microsoft.com/office/word/2012/wordml" xmlns:w16cex="http://schemas.microsoft.com/office/word/2018/wordml/cex" xmlns:w16cid="http://schemas.microsoft.com/office/word/2016/wordml/cid" xmlns:w16="http://schemas.microsoft.com/office/word/2018/wordml" xmlns:w16du="http://schemas.microsoft.com/office/word/2023/wordml/word16du" xmlns:w16sdtdh="http://schemas.microsoft.com/office/word/2020/wordml/sdtdatahash" xmlns:w16sdtfl="http://schemas.microsoft.com/office/word/2024/wordml/sdtformatlock" xmlns:w16se="http://schemas.microsoft.com/office/word/2015/wordml/symex" xmlns:wpg="http://schemas.microsoft.com/office/word/2010/wordprocessingGroup" xmlns:wpi="http://schemas.microsoft.com/office/word/2010/wordprocessingInk" xmlns:wne="http://schemas.microsoft.com/office/word/2006/wordml" xmlns:wps="http://schemas.microsoft.com/office/word/2010/wordprocessingShape" mc:Ignorable="w14 w15 w16se w16cid w16 w16cex w16sdtdh w16sdtfl w16du wp14">
   <w:p>
     <w:pPr>
       <w:pStyle w:val="Header"/>
@@ -1132,10 +1594,16 @@
         <w:noProof/>
       </w:rPr>
       <w:drawing>
-        <wp:inline distT="0" distB="0" distL="0" distR="0" wp14:anchorId="4C3EC566" wp14:editId="1F27BD30">
+        <wp:inline distT="0" distB="0" distL="0" distR="0" wp14:anchorId="69DF7B28" wp14:editId="3D84965B">
           <wp:extent cx="3575866" cy="765459"/>
           <wp:effectExtent l="0" t="0" r="0" b="0"/>
-          <wp:docPr id="1154854086" name="Picture 11"/>
+          <wp:docPr id="903841544" name="Picture 11">
+            <a:extLst xmlns:a="http://schemas.openxmlformats.org/drawingml/2006/main">
+              <a:ext uri="{FF2B5EF4-FFF2-40B4-BE49-F238E27FC236}">
+                <a16:creationId xmlns:a16="http://schemas.microsoft.com/office/drawing/2014/main" id="{FDAECE89-A6D3-4BD6-9E17-EFAFAE260C59}"/>
+              </a:ext>
+            </a:extLst>
+          </wp:docPr>
           <wp:cNvGraphicFramePr>
             <a:graphicFrameLocks xmlns:a="http://schemas.openxmlformats.org/drawingml/2006/main"/>
           </wp:cNvGraphicFramePr>
@@ -1178,7 +1646,7 @@
 </file>
 
 <file path=word/numbering.xml><?xml version="1.0" encoding="utf-8"?>
-<w:numbering xmlns:wpc="http://schemas.microsoft.com/office/word/2010/wordprocessingCanvas" xmlns:cx="http://schemas.microsoft.com/office/drawing/2014/chartex" xmlns:cx1="http://schemas.microsoft.com/office/drawing/2015/9/8/chartex" xmlns:cx2="http://schemas.microsoft.com/office/drawing/2015/10/21/chartex" xmlns:cx3="http://schemas.microsoft.com/office/drawing/2016/5/9/chartex" xmlns:cx4="http://schemas.microsoft.com/office/drawing/2016/5/10/chartex" xmlns:cx5="http://schemas.microsoft.com/office/drawing/2016/5/11/chartex" xmlns:cx6="http://schemas.microsoft.com/office/drawing/2016/5/12/chartex" xmlns:cx7="http://schemas.microsoft.com/office/drawing/2016/5/13/chartex" xmlns:cx8="http://schemas.microsoft.com/office/drawing/2016/5/14/chartex" xmlns:mc="http://schemas.openxmlformats.org/markup-compatibility/2006" xmlns:aink="http://schemas.microsoft.com/office/drawing/2016/ink" xmlns:am3d="http://schemas.microsoft.com/office/drawing/2017/model3d" xmlns:o="urn:schemas-microsoft-com:office:office" xmlns:oel="http://schemas.microsoft.com/office/2019/extlst" xmlns:r="http://schemas.openxmlformats.org/officeDocument/2006/relationships" xmlns:m="http://schemas.openxmlformats.org/officeDocument/2006/math" xmlns:v="urn:schemas-microsoft-com:vml" xmlns:wp14="http://schemas.microsoft.com/office/word/2010/wordprocessingDrawing" xmlns:wp="http://schemas.openxmlformats.org/drawingml/2006/wordprocessingDrawing" xmlns:w10="urn:schemas-microsoft-com:office:word" xmlns:w="http://schemas.openxmlformats.org/wordprocessingml/2006/main" xmlns:w14="http://schemas.microsoft.com/office/word/2010/wordml" xmlns:w15="http://schemas.microsoft.com/office/word/2012/wordml" xmlns:w16cex="http://schemas.microsoft.com/office/word/2018/wordml/cex" xmlns:w16cid="http://schemas.microsoft.com/office/word/2016/wordml/cid" xmlns:w16="http://schemas.microsoft.com/office/word/2018/wordml" xmlns:w16du="http://schemas.microsoft.com/office/word/2023/wordml/word16du" xmlns:w16sdtdh="http://schemas.microsoft.com/office/word/2020/wordml/sdtdatahash" xmlns:w16se="http://schemas.microsoft.com/office/word/2015/wordml/symex" xmlns:wpg="http://schemas.microsoft.com/office/word/2010/wordprocessingGroup" xmlns:wpi="http://schemas.microsoft.com/office/word/2010/wordprocessingInk" xmlns:wne="http://schemas.microsoft.com/office/word/2006/wordml" xmlns:wps="http://schemas.microsoft.com/office/word/2010/wordprocessingShape" mc:Ignorable="w14 w15 w16se w16cid w16 w16cex w16sdtdh w16du wp14">
+<w:numbering xmlns:wpc="http://schemas.microsoft.com/office/word/2010/wordprocessingCanvas" xmlns:cx="http://schemas.microsoft.com/office/drawing/2014/chartex" xmlns:cx1="http://schemas.microsoft.com/office/drawing/2015/9/8/chartex" xmlns:cx2="http://schemas.microsoft.com/office/drawing/2015/10/21/chartex" xmlns:cx3="http://schemas.microsoft.com/office/drawing/2016/5/9/chartex" xmlns:cx4="http://schemas.microsoft.com/office/drawing/2016/5/10/chartex" xmlns:cx5="http://schemas.microsoft.com/office/drawing/2016/5/11/chartex" xmlns:cx6="http://schemas.microsoft.com/office/drawing/2016/5/12/chartex" xmlns:cx7="http://schemas.microsoft.com/office/drawing/2016/5/13/chartex" xmlns:cx8="http://schemas.microsoft.com/office/drawing/2016/5/14/chartex" xmlns:mc="http://schemas.openxmlformats.org/markup-compatibility/2006" xmlns:aink="http://schemas.microsoft.com/office/drawing/2016/ink" xmlns:am3d="http://schemas.microsoft.com/office/drawing/2017/model3d" xmlns:o="urn:schemas-microsoft-com:office:office" xmlns:oel="http://schemas.microsoft.com/office/2019/extlst" xmlns:r="http://schemas.openxmlformats.org/officeDocument/2006/relationships" xmlns:m="http://schemas.openxmlformats.org/officeDocument/2006/math" xmlns:v="urn:schemas-microsoft-com:vml" xmlns:wp14="http://schemas.microsoft.com/office/word/2010/wordprocessingDrawing" xmlns:wp="http://schemas.openxmlformats.org/drawingml/2006/wordprocessingDrawing" xmlns:w10="urn:schemas-microsoft-com:office:word" xmlns:w="http://schemas.openxmlformats.org/wordprocessingml/2006/main" xmlns:w14="http://schemas.microsoft.com/office/word/2010/wordml" xmlns:w15="http://schemas.microsoft.com/office/word/2012/wordml" xmlns:w16cex="http://schemas.microsoft.com/office/word/2018/wordml/cex" xmlns:w16cid="http://schemas.microsoft.com/office/word/2016/wordml/cid" xmlns:w16="http://schemas.microsoft.com/office/word/2018/wordml" xmlns:w16du="http://schemas.microsoft.com/office/word/2023/wordml/word16du" xmlns:w16sdtdh="http://schemas.microsoft.com/office/word/2020/wordml/sdtdatahash" xmlns:w16sdtfl="http://schemas.microsoft.com/office/word/2024/wordml/sdtformatlock" xmlns:w16se="http://schemas.microsoft.com/office/word/2015/wordml/symex" xmlns:wpg="http://schemas.microsoft.com/office/word/2010/wordprocessingGroup" xmlns:wpi="http://schemas.microsoft.com/office/word/2010/wordprocessingInk" xmlns:wne="http://schemas.microsoft.com/office/word/2006/wordml" xmlns:wps="http://schemas.microsoft.com/office/word/2010/wordprocessingShape" mc:Ignorable="w14 w15 w16se w16cid w16 w16cex w16sdtdh w16sdtfl w16du wp14">
   <w:abstractNum w:abstractNumId="0" w15:restartNumberingAfterBreak="0">
     <w:nsid w:val="0D4C4C1B"/>
     <w:multiLevelType w:val="multilevel"/>
@@ -3316,62 +3784,62 @@
       </w:pPr>
     </w:lvl>
   </w:abstractNum>
-  <w:num w:numId="1" w16cid:durableId="1447651260">
+  <w:num w:numId="1" w16cid:durableId="1036076146">
+    <w:abstractNumId w:val="16"/>
+  </w:num>
+  <w:num w:numId="2" w16cid:durableId="1102460539">
+    <w:abstractNumId w:val="12"/>
+  </w:num>
+  <w:num w:numId="3" w16cid:durableId="1220214898">
+    <w:abstractNumId w:val="3"/>
+  </w:num>
+  <w:num w:numId="4" w16cid:durableId="1447651260">
     <w:abstractNumId w:val="7"/>
   </w:num>
-  <w:num w:numId="2" w16cid:durableId="881787386">
-    <w:abstractNumId w:val="13"/>
+  <w:num w:numId="5" w16cid:durableId="1479804923">
+    <w:abstractNumId w:val="6"/>
   </w:num>
-  <w:num w:numId="3" w16cid:durableId="278807419">
-    <w:abstractNumId w:val="15"/>
+  <w:num w:numId="6" w16cid:durableId="1708795999">
+    <w:abstractNumId w:val="5"/>
   </w:num>
-  <w:num w:numId="4" w16cid:durableId="1750423297">
+  <w:num w:numId="7" w16cid:durableId="1750423297">
     <w:abstractNumId w:val="1"/>
   </w:num>
-  <w:num w:numId="5" w16cid:durableId="1036076146">
-    <w:abstractNumId w:val="16"/>
-  </w:num>
-  <w:num w:numId="6" w16cid:durableId="733627566">
-    <w:abstractNumId w:val="0"/>
-  </w:num>
-  <w:num w:numId="7" w16cid:durableId="727266813">
-    <w:abstractNumId w:val="2"/>
-  </w:num>
-  <w:num w:numId="8" w16cid:durableId="2124616861">
-    <w:abstractNumId w:val="11"/>
+  <w:num w:numId="8" w16cid:durableId="1910076465">
+    <w:abstractNumId w:val="14"/>
   </w:num>
   <w:num w:numId="9" w16cid:durableId="2053849097">
     <w:abstractNumId w:val="8"/>
   </w:num>
-  <w:num w:numId="10" w16cid:durableId="1910076465">
-    <w:abstractNumId w:val="14"/>
+  <w:num w:numId="10" w16cid:durableId="2124616861">
+    <w:abstractNumId w:val="11"/>
   </w:num>
-  <w:num w:numId="11" w16cid:durableId="1708795999">
-    <w:abstractNumId w:val="5"/>
-  </w:num>
-  <w:num w:numId="12" w16cid:durableId="23796825">
+  <w:num w:numId="11" w16cid:durableId="23796825">
     <w:abstractNumId w:val="10"/>
   </w:num>
-  <w:num w:numId="13" w16cid:durableId="1479804923">
-    <w:abstractNumId w:val="6"/>
+  <w:num w:numId="12" w16cid:durableId="278807419">
+    <w:abstractNumId w:val="15"/>
   </w:num>
-  <w:num w:numId="14" w16cid:durableId="1220214898">
-    <w:abstractNumId w:val="3"/>
-  </w:num>
-  <w:num w:numId="15" w16cid:durableId="331572745">
+  <w:num w:numId="13" w16cid:durableId="331572745">
     <w:abstractNumId w:val="9"/>
   </w:num>
-  <w:num w:numId="16" w16cid:durableId="353850876">
+  <w:num w:numId="14" w16cid:durableId="353850876">
     <w:abstractNumId w:val="4"/>
   </w:num>
-  <w:num w:numId="17" w16cid:durableId="1102460539">
-    <w:abstractNumId w:val="12"/>
+  <w:num w:numId="15" w16cid:durableId="727266813">
+    <w:abstractNumId w:val="2"/>
+  </w:num>
+  <w:num w:numId="16" w16cid:durableId="733627566">
+    <w:abstractNumId w:val="0"/>
+  </w:num>
+  <w:num w:numId="17" w16cid:durableId="881787386">
+    <w:abstractNumId w:val="13"/>
   </w:num>
 </w:numbering>
 </file>
 
 <file path=word/styles.xml><?xml version="1.0" encoding="utf-8"?>
-<w:styles xmlns:mc="http://schemas.openxmlformats.org/markup-compatibility/2006" xmlns:r="http://schemas.openxmlformats.org/officeDocument/2006/relationships" xmlns:w="http://schemas.openxmlformats.org/wordprocessingml/2006/main" xmlns:w14="http://schemas.microsoft.com/office/word/2010/wordml" xmlns:w15="http://schemas.microsoft.com/office/word/2012/wordml" xmlns:w16cex="http://schemas.microsoft.com/office/word/2018/wordml/cex" xmlns:w16cid="http://schemas.microsoft.com/office/word/2016/wordml/cid" xmlns:w16="http://schemas.microsoft.com/office/word/2018/wordml" xmlns:w16du="http://schemas.microsoft.com/office/word/2023/wordml/word16du" xmlns:w16sdtdh="http://schemas.microsoft.com/office/word/2020/wordml/sdtdatahash" xmlns:w16se="http://schemas.microsoft.com/office/word/2015/wordml/symex" mc:Ignorable="w14 w15 w16se w16cid w16 w16cex w16sdtdh w16du">
+<w:styles xmlns:mc="http://schemas.openxmlformats.org/markup-compatibility/2006" xmlns:r="http://schemas.openxmlformats.org/officeDocument/2006/relationships" xmlns:w="http://schemas.openxmlformats.org/wordprocessingml/2006/main" xmlns:w14="http://schemas.microsoft.com/office/word/2010/wordml" xmlns:w15="http://schemas.microsoft.com/office/word/2012/wordml" xmlns:w16cex="http://schemas.microsoft.com/office/word/2018/wordml/cex" xmlns:w16cid="http://schemas.microsoft.com/office/word/2016/wordml/cid" xmlns:w16="http://schemas.microsoft.com/office/word/2018/wordml" xmlns:w16du="http://schemas.microsoft.com/office/word/2023/wordml/word16du" xmlns:w16sdtdh="http://schemas.microsoft.com/office/word/2020/wordml/sdtdatahash" xmlns:w16sdtfl="http://schemas.microsoft.com/office/word/2024/wordml/sdtformatlock" xmlns:w16se="http://schemas.microsoft.com/office/word/2015/wordml/symex" mc:Ignorable="w14 w15 w16se w16cid w16 w16cex w16sdtdh w16sdtfl w16du">
   <w:docDefaults>
     <w:rPrDefault>
       <w:rPr>

</xml_diff>